<commit_message>
Add TC-004 and TC-005, create BUG-002 (email validation issue)
</commit_message>
<xml_diff>
--- a/03_BugReports/Bug Report - Order form.docx
+++ b/03_BugReports/Bug Report - Order form.docx
@@ -93,7 +93,7 @@
       <w:pPr>
         <w:numPr>
           <w:ilvl w:val="0"/>
-          <w:numId w:val="2"/>
+          <w:numId w:val="3"/>
         </w:numPr>
         <w:spacing w:after="0" w:afterAutospacing="0" w:before="240" w:lineRule="auto"/>
         <w:ind w:left="720" w:hanging="360"/>
@@ -142,7 +142,7 @@
       <w:pPr>
         <w:numPr>
           <w:ilvl w:val="0"/>
-          <w:numId w:val="2"/>
+          <w:numId w:val="3"/>
         </w:numPr>
         <w:spacing w:after="0" w:afterAutospacing="0" w:before="0" w:beforeAutospacing="0" w:lineRule="auto"/>
         <w:ind w:left="720" w:hanging="360"/>
@@ -164,7 +164,7 @@
       <w:pPr>
         <w:numPr>
           <w:ilvl w:val="0"/>
-          <w:numId w:val="2"/>
+          <w:numId w:val="3"/>
         </w:numPr>
         <w:spacing w:after="240" w:before="0" w:beforeAutospacing="0" w:lineRule="auto"/>
         <w:ind w:left="720" w:hanging="360"/>
@@ -322,6 +322,7 @@
       <w:pPr>
         <w:spacing w:after="240" w:before="240" w:lineRule="auto"/>
         <w:rPr>
+          <w:color w:val="ff0000"/>
           <w:sz w:val="26"/>
           <w:szCs w:val="26"/>
         </w:rPr>
@@ -339,6 +340,7 @@
       </w:r>
       <w:r>
         <w:rPr>
+          <w:color w:val="ff0000"/>
           <w:sz w:val="26"/>
           <w:szCs w:val="26"/>
           <w:rtl w:val="0"/>
@@ -378,6 +380,7 @@
       <w:pPr>
         <w:spacing w:after="240" w:before="240" w:lineRule="auto"/>
         <w:rPr>
+          <w:color w:val="ff0000"/>
           <w:sz w:val="26"/>
           <w:szCs w:val="26"/>
         </w:rPr>
@@ -394,6 +397,7 @@
       </w:r>
       <w:r>
         <w:rPr>
+          <w:color w:val="ff0000"/>
           <w:sz w:val="26"/>
           <w:szCs w:val="26"/>
           <w:rtl w:val="0"/>
@@ -405,6 +409,7 @@
       <w:pPr>
         <w:spacing w:after="240" w:before="240" w:lineRule="auto"/>
         <w:rPr>
+          <w:color w:val="ff0000"/>
           <w:sz w:val="26"/>
           <w:szCs w:val="26"/>
         </w:rPr>
@@ -422,6 +427,7 @@
       </w:r>
       <w:r>
         <w:rPr>
+          <w:color w:val="ff0000"/>
           <w:sz w:val="26"/>
           <w:szCs w:val="26"/>
           <w:rtl w:val="0"/>
@@ -448,6 +454,147 @@
           <w:rtl w:val="0"/>
         </w:rPr>
         <w:t xml:space="preserve">Poznámky:</w:t>
+      </w:r>
+    </w:p>
+    <w:p>
+      <w:pPr>
+        <w:numPr>
+          <w:ilvl w:val="0"/>
+          <w:numId w:val="4"/>
+        </w:numPr>
+        <w:spacing w:after="0" w:afterAutospacing="0" w:before="240" w:lineRule="auto"/>
+        <w:ind w:left="720" w:hanging="360"/>
+        <w:rPr>
+          <w:sz w:val="26"/>
+          <w:szCs w:val="26"/>
+        </w:rPr>
+      </w:pPr>
+      <w:r>
+        <w:rPr>
+          <w:sz w:val="26"/>
+          <w:szCs w:val="26"/>
+          <w:rtl w:val="0"/>
+        </w:rPr>
+        <w:t xml:space="preserve">Predvyplnenie pre Klasická športová masáž a Moxovanie funguje správne.</w:t>
+      </w:r>
+    </w:p>
+    <w:p>
+      <w:pPr>
+        <w:numPr>
+          <w:ilvl w:val="0"/>
+          <w:numId w:val="4"/>
+        </w:numPr>
+        <w:spacing w:after="240" w:before="0" w:beforeAutospacing="0" w:lineRule="auto"/>
+        <w:ind w:left="720" w:hanging="360"/>
+        <w:rPr>
+          <w:sz w:val="26"/>
+          <w:szCs w:val="26"/>
+        </w:rPr>
+      </w:pPr>
+      <w:r>
+        <w:rPr>
+          <w:sz w:val="26"/>
+          <w:szCs w:val="26"/>
+          <w:rtl w:val="0"/>
+        </w:rPr>
+        <w:t xml:space="preserve">UX zlepšenie: Odporúča sa doplniť možnosť výberu trvania masáže (30/60 min) pre športovú a relaxačnú masáž.</w:t>
+      </w:r>
+    </w:p>
+    <w:p>
+      <w:pPr>
+        <w:spacing w:after="240" w:before="240" w:lineRule="auto"/>
+        <w:rPr>
+          <w:sz w:val="26"/>
+          <w:szCs w:val="26"/>
+        </w:rPr>
+      </w:pPr>
+      <w:r>
+        <w:rPr>
+          <w:rtl w:val="0"/>
+        </w:rPr>
+      </w:r>
+    </w:p>
+    <w:p>
+      <w:pPr>
+        <w:spacing w:after="240" w:before="240" w:lineRule="auto"/>
+        <w:rPr>
+          <w:sz w:val="26"/>
+          <w:szCs w:val="26"/>
+        </w:rPr>
+      </w:pPr>
+      <w:r>
+        <w:rPr>
+          <w:rtl w:val="0"/>
+        </w:rPr>
+      </w:r>
+    </w:p>
+    <w:p>
+      <w:pPr>
+        <w:spacing w:after="240" w:before="240" w:lineRule="auto"/>
+        <w:rPr>
+          <w:b w:val="1"/>
+          <w:bCs w:val="1"/>
+          <w:sz w:val="26"/>
+          <w:szCs w:val="26"/>
+        </w:rPr>
+      </w:pPr>
+      <w:r>
+        <w:rPr>
+          <w:b w:val="1"/>
+          <w:bCs w:val="1"/>
+          <w:sz w:val="26"/>
+          <w:szCs w:val="26"/>
+          <w:rtl w:val="0"/>
+        </w:rPr>
+        <w:t xml:space="preserve">Bug ID: BUG-002</w:t>
+      </w:r>
+    </w:p>
+    <w:p>
+      <w:pPr>
+        <w:spacing w:after="240" w:before="240" w:lineRule="auto"/>
+        <w:rPr>
+          <w:sz w:val="26"/>
+          <w:szCs w:val="26"/>
+        </w:rPr>
+      </w:pPr>
+      <w:r>
+        <w:rPr>
+          <w:b w:val="1"/>
+          <w:bCs w:val="1"/>
+          <w:sz w:val="26"/>
+          <w:szCs w:val="26"/>
+          <w:rtl w:val="0"/>
+        </w:rPr>
+        <w:t xml:space="preserve">Názov (Summary): </w:t>
+      </w:r>
+      <w:r>
+        <w:rPr>
+          <w:sz w:val="26"/>
+          <w:szCs w:val="26"/>
+          <w:rtl w:val="0"/>
+        </w:rPr>
+        <w:t xml:space="preserve"> Neplatný email formát s dvojitou bodkou je akceptovaný objednávkovým formulárom</w:t>
+      </w:r>
+    </w:p>
+    <w:p>
+      <w:pPr>
+        <w:spacing w:after="240" w:before="240" w:lineRule="auto"/>
+        <w:rPr>
+          <w:b w:val="1"/>
+          <w:bCs w:val="1"/>
+          <w:sz w:val="26"/>
+          <w:szCs w:val="26"/>
+        </w:rPr>
+      </w:pPr>
+      <w:r>
+        <w:rPr>
+          <w:b w:val="1"/>
+          <w:bCs w:val="1"/>
+          <w:sz w:val="26"/>
+          <w:szCs w:val="26"/>
+          <w:rtl w:val="0"/>
+        </w:rPr>
+        <w:t xml:space="preserve">Prostredie:</w:t>
       </w:r>
     </w:p>
     <w:p>
@@ -469,7 +616,56 @@
           <w:szCs w:val="26"/>
           <w:rtl w:val="0"/>
         </w:rPr>
-        <w:t xml:space="preserve">Predvyplnenie pre Klasická športová masáž a Moxovanie funguje správne.</w:t>
+        <w:t xml:space="preserve">Web:</w:t>
+      </w:r>
+      <w:hyperlink r:id="rId10">
+        <w:r>
+          <w:rPr>
+            <w:sz w:val="26"/>
+            <w:szCs w:val="26"/>
+            <w:rtl w:val="0"/>
+          </w:rPr>
+          <w:t xml:space="preserve"> </w:t>
+        </w:r>
+      </w:hyperlink>
+      <w:hyperlink r:id="rId11">
+        <w:r>
+          <w:rPr>
+            <w:color w:val="1155cc"/>
+            <w:sz w:val="26"/>
+            <w:szCs w:val="26"/>
+            <w:u w:val="single"/>
+            <w:rtl w:val="0"/>
+          </w:rPr>
+          <w:t xml:space="preserve">https://www.mobilnemasaze.eu</w:t>
+        </w:r>
+      </w:hyperlink>
+      <w:r>
+        <w:rPr>
+          <w:rtl w:val="0"/>
+        </w:rPr>
+      </w:r>
+    </w:p>
+    <w:p>
+      <w:pPr>
+        <w:numPr>
+          <w:ilvl w:val="0"/>
+          <w:numId w:val="3"/>
+        </w:numPr>
+        <w:spacing w:after="0" w:afterAutospacing="0" w:before="0" w:beforeAutospacing="0" w:lineRule="auto"/>
+        <w:ind w:left="720" w:hanging="360"/>
+        <w:rPr>
+          <w:sz w:val="26"/>
+          <w:szCs w:val="26"/>
+        </w:rPr>
+      </w:pPr>
+      <w:r>
+        <w:rPr>
+          <w:sz w:val="26"/>
+          <w:szCs w:val="26"/>
+          <w:rtl w:val="0"/>
+        </w:rPr>
+        <w:t xml:space="preserve">Prehliadač: Chrome (latest version)</w:t>
       </w:r>
     </w:p>
     <w:p>
@@ -491,7 +687,358 @@
           <w:szCs w:val="26"/>
           <w:rtl w:val="0"/>
         </w:rPr>
-        <w:t xml:space="preserve">UX zlepšenie: Odporúča sa doplniť možnosť výberu trvania masáže (30/60 min) pre športovú a relaxačnú masáž.</w:t>
+        <w:t xml:space="preserve">Zariadenie: Desktop</w:t>
+      </w:r>
+    </w:p>
+    <w:p>
+      <w:pPr>
+        <w:spacing w:after="240" w:before="240" w:lineRule="auto"/>
+        <w:rPr>
+          <w:b w:val="1"/>
+          <w:bCs w:val="1"/>
+          <w:sz w:val="26"/>
+          <w:szCs w:val="26"/>
+        </w:rPr>
+      </w:pPr>
+      <w:r>
+        <w:rPr>
+          <w:b w:val="1"/>
+          <w:bCs w:val="1"/>
+          <w:sz w:val="26"/>
+          <w:szCs w:val="26"/>
+          <w:rtl w:val="0"/>
+        </w:rPr>
+        <w:t xml:space="preserve">Kroky na reprodukciu (Steps to Reproduce):</w:t>
+      </w:r>
+    </w:p>
+    <w:p>
+      <w:pPr>
+        <w:numPr>
+          <w:ilvl w:val="0"/>
+          <w:numId w:val="2"/>
+        </w:numPr>
+        <w:spacing w:after="0" w:afterAutospacing="0" w:before="240" w:lineRule="auto"/>
+        <w:ind w:left="720" w:hanging="360"/>
+        <w:rPr>
+          <w:sz w:val="26"/>
+          <w:szCs w:val="26"/>
+        </w:rPr>
+      </w:pPr>
+      <w:r>
+        <w:rPr>
+          <w:sz w:val="26"/>
+          <w:szCs w:val="26"/>
+          <w:rtl w:val="0"/>
+        </w:rPr>
+        <w:t xml:space="preserve">Otvorte stránku</w:t>
+      </w:r>
+      <w:hyperlink r:id="rId12">
+        <w:r>
+          <w:rPr>
+            <w:sz w:val="26"/>
+            <w:szCs w:val="26"/>
+            <w:rtl w:val="0"/>
+          </w:rPr>
+          <w:t xml:space="preserve"> </w:t>
+        </w:r>
+      </w:hyperlink>
+      <w:hyperlink r:id="rId13">
+        <w:r>
+          <w:rPr>
+            <w:color w:val="1155cc"/>
+            <w:sz w:val="26"/>
+            <w:szCs w:val="26"/>
+            <w:u w:val="single"/>
+            <w:rtl w:val="0"/>
+          </w:rPr>
+          <w:t xml:space="preserve">https://www.mobilnemasaze.eu</w:t>
+        </w:r>
+      </w:hyperlink>
+      <w:r>
+        <w:rPr>
+          <w:rtl w:val="0"/>
+        </w:rPr>
+      </w:r>
+    </w:p>
+    <w:p>
+      <w:pPr>
+        <w:numPr>
+          <w:ilvl w:val="0"/>
+          <w:numId w:val="2"/>
+        </w:numPr>
+        <w:spacing w:after="0" w:afterAutospacing="0" w:before="0" w:beforeAutospacing="0" w:lineRule="auto"/>
+        <w:ind w:left="720" w:hanging="360"/>
+        <w:rPr>
+          <w:sz w:val="26"/>
+          <w:szCs w:val="26"/>
+        </w:rPr>
+      </w:pPr>
+      <w:r>
+        <w:rPr>
+          <w:sz w:val="26"/>
+          <w:szCs w:val="26"/>
+          <w:rtl w:val="0"/>
+        </w:rPr>
+        <w:t xml:space="preserve">Prejdite na objednávkový formulár</w:t>
+      </w:r>
+    </w:p>
+    <w:p>
+      <w:pPr>
+        <w:numPr>
+          <w:ilvl w:val="0"/>
+          <w:numId w:val="2"/>
+        </w:numPr>
+        <w:spacing w:after="0" w:afterAutospacing="0" w:before="0" w:beforeAutospacing="0" w:lineRule="auto"/>
+        <w:ind w:left="720" w:hanging="360"/>
+        <w:rPr>
+          <w:sz w:val="26"/>
+          <w:szCs w:val="26"/>
+        </w:rPr>
+      </w:pPr>
+      <w:r>
+        <w:rPr>
+          <w:sz w:val="26"/>
+          <w:szCs w:val="26"/>
+          <w:rtl w:val="0"/>
+        </w:rPr>
+        <w:t xml:space="preserve">Vyplňte všetky povinné polia správnymi údajmi</w:t>
+      </w:r>
+    </w:p>
+    <w:p>
+      <w:pPr>
+        <w:numPr>
+          <w:ilvl w:val="0"/>
+          <w:numId w:val="2"/>
+        </w:numPr>
+        <w:spacing w:after="0" w:afterAutospacing="0" w:before="0" w:beforeAutospacing="0" w:lineRule="auto"/>
+        <w:ind w:left="720" w:hanging="360"/>
+        <w:rPr>
+          <w:sz w:val="26"/>
+          <w:szCs w:val="26"/>
+        </w:rPr>
+      </w:pPr>
+      <w:r>
+        <w:rPr>
+          <w:sz w:val="26"/>
+          <w:szCs w:val="26"/>
+          <w:rtl w:val="0"/>
+        </w:rPr>
+        <w:t xml:space="preserve">Do poľa „Váš email“ zadajte: </w:t>
+      </w:r>
+      <w:r>
+        <w:rPr>
+          <w:rFonts w:ascii="Roboto Mono" w:cs="Roboto Mono" w:eastAsia="Roboto Mono" w:hAnsi="Roboto Mono"/>
+          <w:color w:val="434343"/>
+          <w:sz w:val="26"/>
+          <w:szCs w:val="26"/>
+          <w:rtl w:val="0"/>
+        </w:rPr>
+        <w:t xml:space="preserve">test..email@gmail.com</w:t>
+      </w:r>
+    </w:p>
+    <w:p>
+      <w:pPr>
+        <w:numPr>
+          <w:ilvl w:val="0"/>
+          <w:numId w:val="2"/>
+        </w:numPr>
+        <w:spacing w:after="240" w:before="0" w:beforeAutospacing="0" w:lineRule="auto"/>
+        <w:ind w:left="720" w:hanging="360"/>
+        <w:rPr>
+          <w:sz w:val="26"/>
+          <w:szCs w:val="26"/>
+        </w:rPr>
+      </w:pPr>
+      <w:r>
+        <w:rPr>
+          <w:sz w:val="26"/>
+          <w:szCs w:val="26"/>
+          <w:rtl w:val="0"/>
+        </w:rPr>
+        <w:t xml:space="preserve">Kliknite na tlačidlo „Odoslať objednávku“</w:t>
+      </w:r>
+    </w:p>
+    <w:p>
+      <w:pPr>
+        <w:spacing w:after="240" w:before="240" w:lineRule="auto"/>
+        <w:rPr>
+          <w:color w:val="ff0000"/>
+          <w:sz w:val="26"/>
+          <w:szCs w:val="26"/>
+        </w:rPr>
+      </w:pPr>
+      <w:r>
+        <w:rPr>
+          <w:b w:val="1"/>
+          <w:bCs w:val="1"/>
+          <w:sz w:val="26"/>
+          <w:szCs w:val="26"/>
+          <w:rtl w:val="0"/>
+        </w:rPr>
+        <w:t xml:space="preserve">Skutočný výsledok (Actual Result):</w:t>
+      </w:r>
+      <w:r>
+        <w:rPr>
+          <w:sz w:val="26"/>
+          <w:szCs w:val="26"/>
+          <w:rtl w:val="0"/>
+        </w:rPr>
+        <w:br w:type="textWrapping"/>
+      </w:r>
+      <w:r>
+        <w:rPr>
+          <w:color w:val="ff0000"/>
+          <w:sz w:val="26"/>
+          <w:szCs w:val="26"/>
+          <w:rtl w:val="0"/>
+        </w:rPr>
+        <w:t xml:space="preserve">Formulár sa úspešne odošle bez zobrazenia validačnej chyby.</w:t>
+      </w:r>
+    </w:p>
+    <w:p>
+      <w:pPr>
+        <w:spacing w:after="240" w:before="240" w:lineRule="auto"/>
+        <w:rPr>
+          <w:sz w:val="26"/>
+          <w:szCs w:val="26"/>
+        </w:rPr>
+      </w:pPr>
+      <w:r>
+        <w:rPr>
+          <w:b w:val="1"/>
+          <w:bCs w:val="1"/>
+          <w:sz w:val="26"/>
+          <w:szCs w:val="26"/>
+          <w:rtl w:val="0"/>
+        </w:rPr>
+        <w:t xml:space="preserve">Očakávaný výsledok (Expected Result):</w:t>
+      </w:r>
+      <w:r>
+        <w:rPr>
+          <w:sz w:val="26"/>
+          <w:szCs w:val="26"/>
+          <w:rtl w:val="0"/>
+        </w:rPr>
+        <w:br w:type="textWrapping"/>
+        <w:t xml:space="preserve">Formulár sa nemá odoslať. Má sa zobraziť validačná hláška informujúca o neplatnom formáte emailu.</w:t>
+      </w:r>
+    </w:p>
+    <w:p>
+      <w:pPr>
+        <w:spacing w:after="240" w:before="240" w:lineRule="auto"/>
+        <w:rPr>
+          <w:color w:val="ff0000"/>
+          <w:sz w:val="26"/>
+          <w:szCs w:val="26"/>
+        </w:rPr>
+      </w:pPr>
+      <w:r>
+        <w:rPr>
+          <w:b w:val="1"/>
+          <w:bCs w:val="1"/>
+          <w:sz w:val="26"/>
+          <w:szCs w:val="26"/>
+          <w:rtl w:val="0"/>
+        </w:rPr>
+        <w:t xml:space="preserve">Závažnosť (Severity): </w:t>
+      </w:r>
+      <w:r>
+        <w:rPr>
+          <w:color w:val="ff0000"/>
+          <w:sz w:val="26"/>
+          <w:szCs w:val="26"/>
+          <w:rtl w:val="0"/>
+        </w:rPr>
+        <w:t xml:space="preserve">Medium</w:t>
+      </w:r>
+    </w:p>
+    <w:p>
+      <w:pPr>
+        <w:spacing w:after="240" w:before="240" w:lineRule="auto"/>
+        <w:rPr>
+          <w:color w:val="ff0000"/>
+          <w:sz w:val="26"/>
+          <w:szCs w:val="26"/>
+        </w:rPr>
+      </w:pPr>
+      <w:r>
+        <w:rPr>
+          <w:b w:val="1"/>
+          <w:bCs w:val="1"/>
+          <w:sz w:val="26"/>
+          <w:szCs w:val="26"/>
+          <w:rtl w:val="0"/>
+        </w:rPr>
+        <w:t xml:space="preserve">Priorita (Priority):</w:t>
+      </w:r>
+      <w:r>
+        <w:rPr>
+          <w:color w:val="ff0000"/>
+          <w:sz w:val="26"/>
+          <w:szCs w:val="26"/>
+          <w:rtl w:val="0"/>
+        </w:rPr>
+        <w:t xml:space="preserve"> Medium</w:t>
+      </w:r>
+    </w:p>
+    <w:p>
+      <w:pPr>
+        <w:spacing w:after="240" w:before="240" w:lineRule="auto"/>
+        <w:rPr>
+          <w:sz w:val="26"/>
+          <w:szCs w:val="26"/>
+        </w:rPr>
+      </w:pPr>
+      <w:r>
+        <w:rPr>
+          <w:b w:val="1"/>
+          <w:bCs w:val="1"/>
+          <w:sz w:val="26"/>
+          <w:szCs w:val="26"/>
+          <w:rtl w:val="0"/>
+        </w:rPr>
+        <w:t xml:space="preserve">Poznámky:</w:t>
+      </w:r>
+      <w:r>
+        <w:rPr>
+          <w:sz w:val="26"/>
+          <w:szCs w:val="26"/>
+          <w:rtl w:val="0"/>
+        </w:rPr>
+        <w:br w:type="textWrapping"/>
+        <w:t xml:space="preserve">Formulár správne zachytáva väčšinu neplatných email formátov (napr. chýbajúce @, doménu alebo .com). Email s dvojitou bodkou v lokálnej časti je však akceptovaný. Odporúča sa implementovať prísnejšiu validáciu (regex alebo backend kontrolu).</w:t>
+      </w:r>
+    </w:p>
+    <w:p>
+      <w:pPr>
+        <w:spacing w:after="240" w:before="240" w:lineRule="auto"/>
+        <w:rPr>
+          <w:b w:val="1"/>
+          <w:bCs w:val="1"/>
+          <w:sz w:val="26"/>
+          <w:szCs w:val="26"/>
+        </w:rPr>
+      </w:pPr>
+      <w:r>
+        <w:rPr>
+          <w:rtl w:val="0"/>
+        </w:rPr>
+      </w:r>
+    </w:p>
+    <w:p>
+      <w:pPr>
+        <w:spacing w:after="240" w:before="240" w:lineRule="auto"/>
+        <w:rPr>
+          <w:b w:val="1"/>
+          <w:bCs w:val="1"/>
+          <w:sz w:val="26"/>
+          <w:szCs w:val="26"/>
+        </w:rPr>
+      </w:pPr>
+      <w:r>
+        <w:rPr>
+          <w:rtl w:val="0"/>
+        </w:rPr>
       </w:r>
     </w:p>
     <w:sectPr>
@@ -618,6 +1165,116 @@
   <w:abstractNum w:abstractNumId="2">
     <w:lvl w:ilvl="0">
       <w:start w:val="1"/>
+      <w:numFmt w:val="decimal"/>
+      <w:lvlText w:val="%1."/>
+      <w:lvlJc w:val="left"/>
+      <w:pPr>
+        <w:ind w:left="720" w:hanging="360"/>
+      </w:pPr>
+      <w:rPr>
+        <w:u w:val="none"/>
+      </w:rPr>
+    </w:lvl>
+    <w:lvl w:ilvl="1">
+      <w:start w:val="1"/>
+      <w:numFmt w:val="lowerLetter"/>
+      <w:lvlText w:val="%2."/>
+      <w:lvlJc w:val="left"/>
+      <w:pPr>
+        <w:ind w:left="1440" w:hanging="360"/>
+      </w:pPr>
+      <w:rPr>
+        <w:u w:val="none"/>
+      </w:rPr>
+    </w:lvl>
+    <w:lvl w:ilvl="2">
+      <w:start w:val="1"/>
+      <w:numFmt w:val="lowerRoman"/>
+      <w:lvlText w:val="%3."/>
+      <w:lvlJc w:val="left"/>
+      <w:pPr>
+        <w:ind w:left="2160" w:hanging="360"/>
+      </w:pPr>
+      <w:rPr>
+        <w:u w:val="none"/>
+      </w:rPr>
+    </w:lvl>
+    <w:lvl w:ilvl="3">
+      <w:start w:val="1"/>
+      <w:numFmt w:val="decimal"/>
+      <w:lvlText w:val="%4."/>
+      <w:lvlJc w:val="left"/>
+      <w:pPr>
+        <w:ind w:left="2880" w:hanging="360"/>
+      </w:pPr>
+      <w:rPr>
+        <w:u w:val="none"/>
+      </w:rPr>
+    </w:lvl>
+    <w:lvl w:ilvl="4">
+      <w:start w:val="1"/>
+      <w:numFmt w:val="lowerLetter"/>
+      <w:lvlText w:val="%5."/>
+      <w:lvlJc w:val="left"/>
+      <w:pPr>
+        <w:ind w:left="3600" w:hanging="360"/>
+      </w:pPr>
+      <w:rPr>
+        <w:u w:val="none"/>
+      </w:rPr>
+    </w:lvl>
+    <w:lvl w:ilvl="5">
+      <w:start w:val="1"/>
+      <w:numFmt w:val="lowerRoman"/>
+      <w:lvlText w:val="%6."/>
+      <w:lvlJc w:val="left"/>
+      <w:pPr>
+        <w:ind w:left="4320" w:hanging="360"/>
+      </w:pPr>
+      <w:rPr>
+        <w:u w:val="none"/>
+      </w:rPr>
+    </w:lvl>
+    <w:lvl w:ilvl="6">
+      <w:start w:val="1"/>
+      <w:numFmt w:val="decimal"/>
+      <w:lvlText w:val="%7."/>
+      <w:lvlJc w:val="left"/>
+      <w:pPr>
+        <w:ind w:left="5040" w:hanging="360"/>
+      </w:pPr>
+      <w:rPr>
+        <w:u w:val="none"/>
+      </w:rPr>
+    </w:lvl>
+    <w:lvl w:ilvl="7">
+      <w:start w:val="1"/>
+      <w:numFmt w:val="lowerLetter"/>
+      <w:lvlText w:val="%8."/>
+      <w:lvlJc w:val="left"/>
+      <w:pPr>
+        <w:ind w:left="5760" w:hanging="360"/>
+      </w:pPr>
+      <w:rPr>
+        <w:u w:val="none"/>
+      </w:rPr>
+    </w:lvl>
+    <w:lvl w:ilvl="8">
+      <w:start w:val="1"/>
+      <w:numFmt w:val="lowerRoman"/>
+      <w:lvlText w:val="%9."/>
+      <w:lvlJc w:val="left"/>
+      <w:pPr>
+        <w:ind w:left="6480" w:hanging="360"/>
+      </w:pPr>
+      <w:rPr>
+        <w:u w:val="none"/>
+      </w:rPr>
+    </w:lvl>
+  </w:abstractNum>
+  <w:abstractNum w:abstractNumId="3">
+    <w:lvl w:ilvl="0">
+      <w:start w:val="1"/>
       <w:numFmt w:val="bullet"/>
       <w:lvlText w:val="●"/>
       <w:lvlJc w:val="left"/>
@@ -725,7 +1382,7 @@
       </w:rPr>
     </w:lvl>
   </w:abstractNum>
-  <w:abstractNum w:abstractNumId="3">
+  <w:abstractNum w:abstractNumId="4">
     <w:lvl w:ilvl="0">
       <w:start w:val="1"/>
       <w:numFmt w:val="bullet"/>
@@ -843,6 +1500,9 @@
   </w:num>
   <w:num w:numId="3">
     <w:abstractNumId w:val="3"/>
+  </w:num>
+  <w:num w:numId="4">
+    <w:abstractNumId w:val="4"/>
   </w:num>
 </w:numbering>
 </file>

</xml_diff>